<commit_message>
Resume: Cyber Security Work From Home Internship @ Cloud Back - Internshala (unknown)
</commit_message>
<xml_diff>
--- a/resumes/Resume_Cyber_Security_Work_From_Home_Inter_Cloud_Back_-_Internshala__unknown_.docx
+++ b/resumes/Resume_Cyber_Security_Work_From_Home_Inter_Cloud_Back_-_Internshala__unknown_.docx
@@ -117,7 +117,7 @@
         <w:pBdr>
           <w:bottom w:val="single" w:sz="6" w:space="1" w:color="000000"/>
         </w:pBdr>
-        <w:spacing w:before="112" w:after="0"/>
+        <w:spacing w:before="20" w:after="0"/>
       </w:pPr>
       <w:r>
         <w:rPr>
@@ -289,7 +289,7 @@
     </w:p>
     <w:p>
       <w:pPr>
-        <w:spacing w:before="23" w:after="23"/>
+        <w:spacing w:before="0" w:after="0"/>
       </w:pPr>
     </w:p>
     <w:p>
@@ -297,7 +297,7 @@
         <w:pBdr>
           <w:bottom w:val="single" w:sz="6" w:space="1" w:color="000000"/>
         </w:pBdr>
-        <w:spacing w:before="112" w:after="0"/>
+        <w:spacing w:before="20" w:after="0"/>
       </w:pPr>
       <w:r>
         <w:rPr>
@@ -404,16 +404,16 @@
           <w:ilvl w:val="0"/>
           <w:numId w:val="2"/>
         </w:numPr>
-        <w:spacing w:before="13" w:after="32"/>
-      </w:pPr>
-      <w:r>
-        <w:rPr>
-          <w:rFonts w:ascii="Source Sans Pro" w:eastAsia="Source Sans Pro" w:hAnsi="Source Sans Pro" w:cs="Source Sans Pro"/>
-          <w:color w:val="000000"/>
-          <w:sz w:val="19"/>
-          <w:szCs w:val="19"/>
-        </w:rPr>
-        <w:t>Triaged 50+ weekly inventory reimbursement cases by severity and policy eligibility, ensuring timely resolution and reducing security risks.</w:t>
+        <w:spacing w:before="13" w:after="13"/>
+      </w:pPr>
+      <w:r>
+        <w:rPr>
+          <w:rFonts w:ascii="Source Sans Pro" w:eastAsia="Source Sans Pro" w:hAnsi="Source Sans Pro" w:cs="Source Sans Pro"/>
+          <w:color w:val="000000"/>
+          <w:sz w:val="19"/>
+          <w:szCs w:val="19"/>
+        </w:rPr>
+        <w:t>Triaged 50+ weekly inventory reimbursement cases by severity and policy eligibility, ensuring timely resolution and reducing repeat-issue investigation time.</w:t>
       </w:r>
     </w:p>
     <w:p>
@@ -423,16 +423,16 @@
           <w:ilvl w:val="0"/>
           <w:numId w:val="2"/>
         </w:numPr>
-        <w:spacing w:before="13" w:after="32"/>
-      </w:pPr>
-      <w:r>
-        <w:rPr>
-          <w:rFonts w:ascii="Source Sans Pro" w:eastAsia="Source Sans Pro" w:hAnsi="Source Sans Pro" w:cs="Source Sans Pro"/>
-          <w:color w:val="000000"/>
-          <w:sz w:val="19"/>
-          <w:szCs w:val="19"/>
-        </w:rPr>
-        <w:t>Investigated seller claims, identifying policy violations and anomalous patterns to prevent cyber threats and maintain cloud security.</w:t>
+        <w:spacing w:before="13" w:after="13"/>
+      </w:pPr>
+      <w:r>
+        <w:rPr>
+          <w:rFonts w:ascii="Source Sans Pro" w:eastAsia="Source Sans Pro" w:hAnsi="Source Sans Pro" w:cs="Source Sans Pro"/>
+          <w:color w:val="000000"/>
+          <w:sz w:val="19"/>
+          <w:szCs w:val="19"/>
+        </w:rPr>
+        <w:t>Investigated seller claims, identifying policy violations and anomalous patterns to prevent future occurrences.</w:t>
       </w:r>
     </w:p>
     <w:p>
@@ -442,16 +442,16 @@
           <w:ilvl w:val="0"/>
           <w:numId w:val="2"/>
         </w:numPr>
-        <w:spacing w:before="13" w:after="32"/>
-      </w:pPr>
-      <w:r>
-        <w:rPr>
-          <w:rFonts w:ascii="Source Sans Pro" w:eastAsia="Source Sans Pro" w:hAnsi="Source Sans Pro" w:cs="Source Sans Pro"/>
-          <w:color w:val="000000"/>
-          <w:sz w:val="19"/>
-          <w:szCs w:val="19"/>
-        </w:rPr>
-        <w:t>Analyzed 200+ weekly cases to detect recurring fraud patterns, reducing repeat-issue investigation time and enhancing security posture.</w:t>
+        <w:spacing w:before="13" w:after="13"/>
+      </w:pPr>
+      <w:r>
+        <w:rPr>
+          <w:rFonts w:ascii="Source Sans Pro" w:eastAsia="Source Sans Pro" w:hAnsi="Source Sans Pro" w:cs="Source Sans Pro"/>
+          <w:color w:val="000000"/>
+          <w:sz w:val="19"/>
+          <w:szCs w:val="19"/>
+        </w:rPr>
+        <w:t>Analyzed 200+ weekly cases to detect recurring fraud patterns, flagging them early to minimize investigation time and costs.</w:t>
       </w:r>
     </w:p>
     <w:p>
@@ -461,21 +461,21 @@
           <w:ilvl w:val="0"/>
           <w:numId w:val="2"/>
         </w:numPr>
-        <w:spacing w:before="13" w:after="32"/>
-      </w:pPr>
-      <w:r>
-        <w:rPr>
-          <w:rFonts w:ascii="Source Sans Pro" w:eastAsia="Source Sans Pro" w:hAnsi="Source Sans Pro" w:cs="Source Sans Pro"/>
-          <w:color w:val="000000"/>
-          <w:sz w:val="19"/>
-          <w:szCs w:val="19"/>
-        </w:rPr>
-        <w:t>Documented audit-ready case findings, decisions, evidence notes, and corrective actions, maintaining accurate and secure records.</w:t>
-      </w:r>
-    </w:p>
-    <w:p>
-      <w:pPr>
-        <w:spacing w:before="23" w:after="23"/>
+        <w:spacing w:before="13" w:after="13"/>
+      </w:pPr>
+      <w:r>
+        <w:rPr>
+          <w:rFonts w:ascii="Source Sans Pro" w:eastAsia="Source Sans Pro" w:hAnsi="Source Sans Pro" w:cs="Source Sans Pro"/>
+          <w:color w:val="000000"/>
+          <w:sz w:val="19"/>
+          <w:szCs w:val="19"/>
+        </w:rPr>
+        <w:t>Spotted recurring fraud patterns across 200+ weekly cases and flagged repeat issues early, reducing investigation cycles before escalation.</w:t>
+      </w:r>
+    </w:p>
+    <w:p>
+      <w:pPr>
+        <w:spacing w:before="0" w:after="0"/>
         <w:rPr>
           <w:rFonts w:ascii="Source Sans Pro" w:eastAsia="Source Sans Pro" w:hAnsi="Source Sans Pro" w:cs="Source Sans Pro"/>
           <w:b/>
@@ -488,7 +488,7 @@
     </w:p>
     <w:p>
       <w:pPr>
-        <w:spacing w:before="105" w:after="13"/>
+        <w:spacing w:before="13" w:after="13"/>
       </w:pPr>
       <w:r>
         <w:rPr>
@@ -555,16 +555,16 @@
           <w:ilvl w:val="0"/>
           <w:numId w:val="2"/>
         </w:numPr>
-        <w:spacing w:before="13" w:after="32"/>
-      </w:pPr>
-      <w:r>
-        <w:rPr>
-          <w:rFonts w:ascii="Source Sans Pro" w:eastAsia="Source Sans Pro" w:hAnsi="Source Sans Pro" w:cs="Source Sans Pro"/>
-          <w:color w:val="000000"/>
-          <w:sz w:val="19"/>
-          <w:szCs w:val="19"/>
-        </w:rPr>
-        <w:t>Developed Splunk SIEM with SPL searches for brute-force detection, lateral movement, and privilege escalation (T1110, T1078, T1059); mapped TTPs to MITRE ATT&amp;CK and wrote incident report.</w:t>
+        <w:spacing w:before="13" w:after="13"/>
+      </w:pPr>
+      <w:r>
+        <w:rPr>
+          <w:rFonts w:ascii="Source Sans Pro" w:eastAsia="Source Sans Pro" w:hAnsi="Source Sans Pro" w:cs="Source Sans Pro"/>
+          <w:color w:val="000000"/>
+          <w:sz w:val="19"/>
+          <w:szCs w:val="19"/>
+        </w:rPr>
+        <w:t>Developed Splunk SIEM with SPL correlation (detection engineering) searches for brute-force detection (index=* failed | stats count by src_ip), lateral movement, and privilege escalation; mapped TTPs to MITRE ATT&amp;CK (TTP mapping) (T1110, T1078, T1059) and wrote PICERL incident report.</w:t>
       </w:r>
     </w:p>
     <w:p>
@@ -574,16 +574,16 @@
           <w:ilvl w:val="0"/>
           <w:numId w:val="2"/>
         </w:numPr>
-        <w:spacing w:before="13" w:after="32"/>
-      </w:pPr>
-      <w:r>
-        <w:rPr>
-          <w:rFonts w:ascii="Source Sans Pro" w:eastAsia="Source Sans Pro" w:hAnsi="Source Sans Pro" w:cs="Source Sans Pro"/>
-          <w:color w:val="000000"/>
-          <w:sz w:val="19"/>
-          <w:szCs w:val="19"/>
-        </w:rPr>
-        <w:t>Developed SOAR-style detection pipeline: Python script ingests Splunk alerts, enriches with VirusTotal API, and dispatches Telegram notifications with severity classification.</w:t>
+        <w:spacing w:before="13" w:after="13"/>
+      </w:pPr>
+      <w:r>
+        <w:rPr>
+          <w:rFonts w:ascii="Source Sans Pro" w:eastAsia="Source Sans Pro" w:hAnsi="Source Sans Pro" w:cs="Source Sans Pro"/>
+          <w:color w:val="000000"/>
+          <w:sz w:val="19"/>
+          <w:szCs w:val="19"/>
+        </w:rPr>
+        <w:t>Built automated SOAR (security orchestration and automation)-style detection pipeline: Python script ingests Splunk alerts, runs IOC enrichment (threat intelligence) via VirusTotal API, and dispatches Telegram notifications with severity classification.</w:t>
       </w:r>
     </w:p>
     <w:p>
@@ -593,21 +593,21 @@
           <w:ilvl w:val="0"/>
           <w:numId w:val="2"/>
         </w:numPr>
-        <w:spacing w:before="13" w:after="32"/>
-      </w:pPr>
-      <w:r>
-        <w:rPr>
-          <w:rFonts w:ascii="Source Sans Pro" w:eastAsia="Source Sans Pro" w:hAnsi="Source Sans Pro" w:cs="Source Sans Pro"/>
-          <w:color w:val="000000"/>
-          <w:sz w:val="19"/>
-          <w:szCs w:val="19"/>
-        </w:rPr>
-        <w:t>Converted detection logic to Sigma rules (detection-as-code) for enterprise SOCs; analyzed TCP/IP in Wireshark for SYN scans, DNS tunnelling, and plaintext credential exposure.</w:t>
-      </w:r>
-    </w:p>
-    <w:p>
-      <w:pPr>
-        <w:spacing w:before="23" w:after="23"/>
+        <w:spacing w:before="13" w:after="13"/>
+      </w:pPr>
+      <w:r>
+        <w:rPr>
+          <w:rFonts w:ascii="Source Sans Pro" w:eastAsia="Source Sans Pro" w:hAnsi="Source Sans Pro" w:cs="Source Sans Pro"/>
+          <w:color w:val="000000"/>
+          <w:sz w:val="19"/>
+          <w:szCs w:val="19"/>
+        </w:rPr>
+        <w:t>Converted detection logic to Sigma rules (detection-as-code) (vendor-neutral format used by enterprise SOCs); performed TCP/IP analysis in Wireshark to detect SYN scans, DNS tunnelling, and plaintext credential exposure on unencrypted sessions.</w:t>
+      </w:r>
+    </w:p>
+    <w:p>
+      <w:pPr>
+        <w:spacing w:before="0" w:after="0"/>
       </w:pPr>
     </w:p>
     <w:p>
@@ -663,16 +663,16 @@
           <w:ilvl w:val="0"/>
           <w:numId w:val="2"/>
         </w:numPr>
-        <w:spacing w:before="13" w:after="32"/>
-      </w:pPr>
-      <w:r>
-        <w:rPr>
-          <w:rFonts w:ascii="Source Sans Pro" w:eastAsia="Source Sans Pro" w:hAnsi="Source Sans Pro" w:cs="Source Sans Pro"/>
-          <w:color w:val="000000"/>
-          <w:sz w:val="19"/>
-          <w:szCs w:val="19"/>
-        </w:rPr>
-        <w:t>Developed automated vulnerability pipeline integrating Nessus and OpenVAS APIs in Python, generating CVE reports with CVSS severity and EPSS context from FIRST.org API.</w:t>
+        <w:spacing w:before="13" w:after="13"/>
+      </w:pPr>
+      <w:r>
+        <w:rPr>
+          <w:rFonts w:ascii="Source Sans Pro" w:eastAsia="Source Sans Pro" w:hAnsi="Source Sans Pro" w:cs="Source Sans Pro"/>
+          <w:color w:val="000000"/>
+          <w:sz w:val="19"/>
+          <w:szCs w:val="19"/>
+        </w:rPr>
+        <w:t>Built automated vulnerability assessment pipeline integrating Nessus and OpenVAS REST APIs in Python; generated CVE reports classified by CVSS severity (vulnerability prioritisation) and EPSS context from the FIRST.org API.</w:t>
       </w:r>
     </w:p>
     <w:p>
@@ -682,16 +682,16 @@
           <w:ilvl w:val="0"/>
           <w:numId w:val="2"/>
         </w:numPr>
-        <w:spacing w:before="13" w:after="32"/>
-      </w:pPr>
-      <w:r>
-        <w:rPr>
-          <w:rFonts w:ascii="Source Sans Pro" w:eastAsia="Source Sans Pro" w:hAnsi="Source Sans Pro" w:cs="Source Sans Pro"/>
-          <w:color w:val="000000"/>
-          <w:sz w:val="19"/>
-          <w:szCs w:val="19"/>
-        </w:rPr>
-        <w:t>Developed OWASP Top 10 automated web checker to detect web app vulnerabilities (injection, auth, SSRF) and documented SQL injection remediation.</w:t>
+        <w:spacing w:before="13" w:after="13"/>
+      </w:pPr>
+      <w:r>
+        <w:rPr>
+          <w:rFonts w:ascii="Source Sans Pro" w:eastAsia="Source Sans Pro" w:hAnsi="Source Sans Pro" w:cs="Source Sans Pro"/>
+          <w:color w:val="000000"/>
+          <w:sz w:val="19"/>
+          <w:szCs w:val="19"/>
+        </w:rPr>
+        <w:t>Developed OWASP Top 10 (web application security) automated web checker that sends crafted HTTP requests to detect injection, broken auth, and SSRF vulnerabilities; documented SQL injection exploit and parameterised query remediation.</w:t>
       </w:r>
     </w:p>
     <w:p>
@@ -701,7 +701,7 @@
           <w:ilvl w:val="0"/>
           <w:numId w:val="2"/>
         </w:numPr>
-        <w:spacing w:before="13" w:after="32"/>
+        <w:spacing w:before="13" w:after="13"/>
       </w:pPr>
       <w:r>
         <w:rPr>
@@ -716,7 +716,7 @@
     <w:p>
       <w:pPr>
         <w:pStyle w:val="ListParagraph"/>
-        <w:spacing w:before="23" w:after="23"/>
+        <w:spacing w:before="0" w:after="0"/>
         <w:ind w:left="450"/>
       </w:pPr>
     </w:p>
@@ -725,7 +725,7 @@
         <w:pBdr>
           <w:bottom w:val="single" w:sz="6" w:space="1" w:color="000000"/>
         </w:pBdr>
-        <w:spacing w:before="112" w:after="0"/>
+        <w:spacing w:before="20" w:after="0"/>
       </w:pPr>
       <w:r>
         <w:rPr>
@@ -741,7 +741,7 @@
     </w:p>
     <w:p>
       <w:pPr>
-        <w:spacing w:before="47" w:after="47"/>
+        <w:spacing w:before="24" w:after="24"/>
       </w:pPr>
       <w:r>
         <w:rPr>
@@ -763,7 +763,7 @@
     </w:p>
     <w:p>
       <w:pPr>
-        <w:spacing w:before="47" w:after="47"/>
+        <w:spacing w:before="24" w:after="24"/>
       </w:pPr>
       <w:r>
         <w:rPr>
@@ -785,7 +785,7 @@
     </w:p>
     <w:p>
       <w:pPr>
-        <w:spacing w:before="47" w:after="47"/>
+        <w:spacing w:before="24" w:after="24"/>
       </w:pPr>
       <w:r>
         <w:rPr>
@@ -807,7 +807,7 @@
     </w:p>
     <w:p>
       <w:pPr>
-        <w:spacing w:before="47" w:after="47"/>
+        <w:spacing w:before="24" w:after="24"/>
       </w:pPr>
       <w:r>
         <w:rPr>
@@ -829,7 +829,7 @@
     </w:p>
     <w:p>
       <w:pPr>
-        <w:spacing w:before="47" w:after="47"/>
+        <w:spacing w:before="24" w:after="24"/>
       </w:pPr>
       <w:r>
         <w:rPr>
@@ -854,7 +854,7 @@
         <w:pBdr>
           <w:bottom w:val="single" w:sz="6" w:space="1" w:color="000000"/>
         </w:pBdr>
-        <w:spacing w:before="23" w:after="23"/>
+        <w:spacing w:before="0" w:after="0"/>
         <w:rPr>
           <w:rFonts w:ascii="Source Sans Pro" w:eastAsia="Source Sans Pro" w:hAnsi="Source Sans Pro" w:cs="Source Sans Pro"/>
           <w:b/>
@@ -870,7 +870,7 @@
         <w:pBdr>
           <w:bottom w:val="single" w:sz="6" w:space="1" w:color="000000"/>
         </w:pBdr>
-        <w:spacing w:before="112" w:after="0"/>
+        <w:spacing w:before="20" w:after="0"/>
       </w:pPr>
       <w:r>
         <w:rPr>
@@ -891,7 +891,7 @@
           <w:ilvl w:val="0"/>
           <w:numId w:val="2"/>
         </w:numPr>
-        <w:spacing w:before="13" w:after="32"/>
+        <w:spacing w:before="13" w:after="13"/>
       </w:pPr>
       <w:r>
         <w:rPr>
@@ -910,7 +910,7 @@
           <w:ilvl w:val="0"/>
           <w:numId w:val="2"/>
         </w:numPr>
-        <w:spacing w:before="13" w:after="32"/>
+        <w:spacing w:before="13" w:after="13"/>
       </w:pPr>
       <w:r>
         <w:rPr>

</xml_diff>